<commit_message>
Ready to task 2
</commit_message>
<xml_diff>
--- a/Part A/Part A - Apache Jmeter.docx
+++ b/Part A/Part A - Apache Jmeter.docx
@@ -1000,8 +1000,16 @@
               <w:rPr>
                 <w:rFonts w:ascii="Times New Roman" w:eastAsia="Times New Roman" w:hAnsi="Times New Roman" w:cs="Times New Roman"/>
               </w:rPr>
-              <w:t>Ms. Yella Mehroze</w:t>
-            </w:r>
+              <w:t xml:space="preserve">Ms. Yella </w:t>
+            </w:r>
+            <w:proofErr w:type="spellStart"/>
+            <w:r>
+              <w:rPr>
+                <w:rFonts w:ascii="Times New Roman" w:eastAsia="Times New Roman" w:hAnsi="Times New Roman" w:cs="Times New Roman"/>
+              </w:rPr>
+              <w:t>Mehroze</w:t>
+            </w:r>
+            <w:proofErr w:type="spellEnd"/>
           </w:p>
         </w:tc>
         <w:tc>
@@ -1243,7 +1251,7 @@
               <w:rPr>
                 <w:rFonts w:ascii="Times New Roman" w:eastAsia="Times New Roman" w:hAnsi="Times New Roman" w:cs="Times New Roman"/>
               </w:rPr>
-              <w:t>A,</w:t>
+              <w:t>A</w:t>
             </w:r>
           </w:p>
         </w:tc>
@@ -2016,8 +2024,19 @@
                     <w:sz w:val="18"/>
                     <w:szCs w:val="18"/>
                   </w:rPr>
-                  <w:t xml:space="preserve">  C:\JMeter   or   /opt/jmeter</w:t>
+                  <w:t xml:space="preserve">  C:\JMeter   or   /opt/</w:t>
                 </w:r>
+                <w:proofErr w:type="spellStart"/>
+                <w:r>
+                  <w:rPr>
+                    <w:rFonts w:ascii="Arial Unicode MS" w:eastAsia="Arial Unicode MS" w:hAnsi="Arial Unicode MS" w:cs="Arial Unicode MS"/>
+                    <w:color w:val="333333"/>
+                    <w:sz w:val="18"/>
+                    <w:szCs w:val="18"/>
+                  </w:rPr>
+                  <w:t>jmeter</w:t>
+                </w:r>
+                <w:proofErr w:type="spellEnd"/>
               </w:sdtContent>
             </w:sdt>
           </w:p>
@@ -2582,17 +2601,229 @@
         <w:t>Click the green Run button. Confirm a GREEN result. Note the response time and response code</w:t>
       </w:r>
     </w:p>
+    <w:p/>
     <w:p>
       <w:pPr>
-        <w:pStyle w:val="Heading2"/>
         <w:jc w:val="center"/>
       </w:pPr>
+      <w:r>
+        <w:drawing>
+          <wp:inline distT="0" distB="0" distL="0" distR="0" wp14:anchorId="3F05C612" wp14:editId="73D2DB24">
+            <wp:extent cx="3154377" cy="2370764"/>
+            <wp:effectExtent l="76200" t="76200" r="141605" b="125095"/>
+            <wp:docPr id="601833676" name="Picture 1"/>
+            <wp:cNvGraphicFramePr>
+              <a:graphicFrameLocks xmlns:a="http://schemas.openxmlformats.org/drawingml/2006/main" noChangeAspect="1"/>
+            </wp:cNvGraphicFramePr>
+            <a:graphic xmlns:a="http://schemas.openxmlformats.org/drawingml/2006/main">
+              <a:graphicData uri="http://schemas.openxmlformats.org/drawingml/2006/picture">
+                <pic:pic xmlns:pic="http://schemas.openxmlformats.org/drawingml/2006/picture">
+                  <pic:nvPicPr>
+                    <pic:cNvPr id="601833676" name=""/>
+                    <pic:cNvPicPr/>
+                  </pic:nvPicPr>
+                  <pic:blipFill>
+                    <a:blip r:embed="rId12"/>
+                    <a:stretch>
+                      <a:fillRect/>
+                    </a:stretch>
+                  </pic:blipFill>
+                  <pic:spPr>
+                    <a:xfrm>
+                      <a:off x="0" y="0"/>
+                      <a:ext cx="3165173" cy="2378878"/>
+                    </a:xfrm>
+                    <a:prstGeom prst="rect">
+                      <a:avLst/>
+                    </a:prstGeom>
+                    <a:ln w="38100" cap="sq">
+                      <a:solidFill>
+                        <a:srgbClr val="000000"/>
+                      </a:solidFill>
+                      <a:prstDash val="solid"/>
+                      <a:miter lim="800000"/>
+                    </a:ln>
+                    <a:effectLst>
+                      <a:outerShdw blurRad="50800" dist="38100" dir="2700000" algn="tl" rotWithShape="0">
+                        <a:srgbClr val="000000">
+                          <a:alpha val="43000"/>
+                        </a:srgbClr>
+                      </a:outerShdw>
+                    </a:effectLst>
+                  </pic:spPr>
+                </pic:pic>
+              </a:graphicData>
+            </a:graphic>
+          </wp:inline>
+        </w:drawing>
+      </w:r>
     </w:p>
     <w:p>
       <w:pPr>
-        <w:pStyle w:val="Heading2"/>
-      </w:pPr>
-      <w:r>
+        <w:jc w:val="center"/>
+      </w:pPr>
+      <w:r>
+        <w:drawing>
+          <wp:inline distT="0" distB="0" distL="0" distR="0" wp14:anchorId="1EFC9DCB" wp14:editId="51D4C1F0">
+            <wp:extent cx="5869961" cy="1280560"/>
+            <wp:effectExtent l="76200" t="76200" r="130810" b="129540"/>
+            <wp:docPr id="338873900" name="Picture 1"/>
+            <wp:cNvGraphicFramePr>
+              <a:graphicFrameLocks xmlns:a="http://schemas.openxmlformats.org/drawingml/2006/main" noChangeAspect="1"/>
+            </wp:cNvGraphicFramePr>
+            <a:graphic xmlns:a="http://schemas.openxmlformats.org/drawingml/2006/main">
+              <a:graphicData uri="http://schemas.openxmlformats.org/drawingml/2006/picture">
+                <pic:pic xmlns:pic="http://schemas.openxmlformats.org/drawingml/2006/picture">
+                  <pic:nvPicPr>
+                    <pic:cNvPr id="338873900" name=""/>
+                    <pic:cNvPicPr/>
+                  </pic:nvPicPr>
+                  <pic:blipFill>
+                    <a:blip r:embed="rId13"/>
+                    <a:stretch>
+                      <a:fillRect/>
+                    </a:stretch>
+                  </pic:blipFill>
+                  <pic:spPr>
+                    <a:xfrm>
+                      <a:off x="0" y="0"/>
+                      <a:ext cx="5881190" cy="1283010"/>
+                    </a:xfrm>
+                    <a:prstGeom prst="rect">
+                      <a:avLst/>
+                    </a:prstGeom>
+                    <a:ln w="38100" cap="sq">
+                      <a:solidFill>
+                        <a:srgbClr val="000000"/>
+                      </a:solidFill>
+                      <a:prstDash val="solid"/>
+                      <a:miter lim="800000"/>
+                    </a:ln>
+                    <a:effectLst>
+                      <a:outerShdw blurRad="50800" dist="38100" dir="2700000" algn="tl" rotWithShape="0">
+                        <a:srgbClr val="000000">
+                          <a:alpha val="43000"/>
+                        </a:srgbClr>
+                      </a:outerShdw>
+                    </a:effectLst>
+                  </pic:spPr>
+                </pic:pic>
+              </a:graphicData>
+            </a:graphic>
+          </wp:inline>
+        </w:drawing>
+      </w:r>
+    </w:p>
+    <w:p>
+      <w:pPr>
+        <w:rPr>
+          <w:rFonts w:ascii="Times New Roman" w:hAnsi="Times New Roman" w:cs="Times New Roman"/>
+          <w:sz w:val="24"/>
+          <w:szCs w:val="24"/>
+        </w:rPr>
+      </w:pPr>
+    </w:p>
+    <w:p>
+      <w:pPr>
+        <w:rPr>
+          <w:rFonts w:ascii="Times New Roman" w:hAnsi="Times New Roman" w:cs="Times New Roman"/>
+          <w:sz w:val="24"/>
+          <w:szCs w:val="24"/>
+        </w:rPr>
+      </w:pPr>
+      <w:r>
+        <w:rPr>
+          <w:rFonts w:ascii="Times New Roman" w:hAnsi="Times New Roman" w:cs="Times New Roman"/>
+          <w:sz w:val="24"/>
+          <w:szCs w:val="24"/>
+        </w:rPr>
+        <w:t>Response Time:</w:t>
+      </w:r>
+      <w:r>
+        <w:rPr>
+          <w:rFonts w:ascii="Times New Roman" w:hAnsi="Times New Roman" w:cs="Times New Roman"/>
+          <w:sz w:val="24"/>
+          <w:szCs w:val="24"/>
+        </w:rPr>
+        <w:tab/>
+      </w:r>
+      <w:r>
+        <w:rPr>
+          <w:rFonts w:ascii="Times New Roman" w:hAnsi="Times New Roman" w:cs="Times New Roman"/>
+          <w:i/>
+          <w:iCs/>
+          <w:sz w:val="24"/>
+          <w:szCs w:val="24"/>
+        </w:rPr>
+        <w:t>0.86/sec</w:t>
+      </w:r>
+      <w:r>
+        <w:rPr>
+          <w:rFonts w:ascii="Times New Roman" w:hAnsi="Times New Roman" w:cs="Times New Roman"/>
+          <w:sz w:val="24"/>
+          <w:szCs w:val="24"/>
+        </w:rPr>
+        <w:t xml:space="preserve"> received; </w:t>
+      </w:r>
+      <w:r>
+        <w:rPr>
+          <w:rFonts w:ascii="Times New Roman" w:hAnsi="Times New Roman" w:cs="Times New Roman"/>
+          <w:i/>
+          <w:iCs/>
+          <w:sz w:val="24"/>
+          <w:szCs w:val="24"/>
+        </w:rPr>
+        <w:t>0.08/sec</w:t>
+      </w:r>
+      <w:r>
+        <w:rPr>
+          <w:rFonts w:ascii="Times New Roman" w:hAnsi="Times New Roman" w:cs="Times New Roman"/>
+          <w:sz w:val="24"/>
+          <w:szCs w:val="24"/>
+        </w:rPr>
+        <w:t xml:space="preserve"> sent</w:t>
+      </w:r>
+    </w:p>
+    <w:p>
+      <w:pPr>
+        <w:rPr>
+          <w:rFonts w:ascii="Times New Roman" w:hAnsi="Times New Roman" w:cs="Times New Roman"/>
+          <w:sz w:val="24"/>
+          <w:szCs w:val="24"/>
+        </w:rPr>
+      </w:pPr>
+      <w:r>
+        <w:rPr>
+          <w:rFonts w:ascii="Times New Roman" w:hAnsi="Times New Roman" w:cs="Times New Roman"/>
+          <w:sz w:val="24"/>
+          <w:szCs w:val="24"/>
+        </w:rPr>
+        <w:t>Response Code:</w:t>
+      </w:r>
+      <w:r>
+        <w:rPr>
+          <w:rFonts w:ascii="Times New Roman" w:hAnsi="Times New Roman" w:cs="Times New Roman"/>
+          <w:sz w:val="24"/>
+          <w:szCs w:val="24"/>
+        </w:rPr>
+        <w:tab/>
+        <w:t>200</w:t>
+      </w:r>
+    </w:p>
+    <w:p>
+      <w:pPr>
+        <w:rPr>
+          <w:rFonts w:ascii="Times New Roman" w:hAnsi="Times New Roman" w:cs="Times New Roman"/>
+          <w:sz w:val="24"/>
+          <w:szCs w:val="24"/>
+        </w:rPr>
+      </w:pPr>
+      <w:r>
+        <w:rPr>
+          <w:rFonts w:ascii="Times New Roman" w:hAnsi="Times New Roman" w:cs="Times New Roman"/>
+          <w:sz w:val="24"/>
+          <w:szCs w:val="24"/>
+        </w:rPr>
         <w:br w:type="page"/>
       </w:r>
     </w:p>
@@ -2700,7 +2931,47 @@
                 <w:sz w:val="18"/>
                 <w:szCs w:val="18"/>
               </w:rPr>
-              <w:t xml:space="preserve">  Body: {"title":"Test Post","body":"Hello World","userId":1}</w:t>
+              <w:t xml:space="preserve">  Body: {"</w:t>
+            </w:r>
+            <w:proofErr w:type="spellStart"/>
+            <w:r>
+              <w:rPr>
+                <w:rFonts w:ascii="Courier New" w:eastAsia="Courier New" w:hAnsi="Courier New" w:cs="Courier New"/>
+                <w:color w:val="D4D4D4"/>
+                <w:sz w:val="18"/>
+                <w:szCs w:val="18"/>
+              </w:rPr>
+              <w:t>title":"Test</w:t>
+            </w:r>
+            <w:proofErr w:type="spellEnd"/>
+            <w:r>
+              <w:rPr>
+                <w:rFonts w:ascii="Courier New" w:eastAsia="Courier New" w:hAnsi="Courier New" w:cs="Courier New"/>
+                <w:color w:val="D4D4D4"/>
+                <w:sz w:val="18"/>
+                <w:szCs w:val="18"/>
+              </w:rPr>
+              <w:t xml:space="preserve"> </w:t>
+            </w:r>
+            <w:proofErr w:type="spellStart"/>
+            <w:r>
+              <w:rPr>
+                <w:rFonts w:ascii="Courier New" w:eastAsia="Courier New" w:hAnsi="Courier New" w:cs="Courier New"/>
+                <w:color w:val="D4D4D4"/>
+                <w:sz w:val="18"/>
+                <w:szCs w:val="18"/>
+              </w:rPr>
+              <w:t>Post","body":"Hello</w:t>
+            </w:r>
+            <w:proofErr w:type="spellEnd"/>
+            <w:r>
+              <w:rPr>
+                <w:rFonts w:ascii="Courier New" w:eastAsia="Courier New" w:hAnsi="Courier New" w:cs="Courier New"/>
+                <w:color w:val="D4D4D4"/>
+                <w:sz w:val="18"/>
+                <w:szCs w:val="18"/>
+              </w:rPr>
+              <w:t xml:space="preserve"> World","userId":1}</w:t>
             </w:r>
           </w:p>
           <w:p>
@@ -2733,7 +3004,27 @@
                 <w:sz w:val="18"/>
                 <w:szCs w:val="18"/>
               </w:rPr>
-              <w:t xml:space="preserve">  Body: {"id":1,"title":"Updated Title","body":"Updated Body","userId":1}</w:t>
+              <w:t xml:space="preserve">  Body: {"id":1,"title":"Updated </w:t>
+            </w:r>
+            <w:proofErr w:type="spellStart"/>
+            <w:r>
+              <w:rPr>
+                <w:rFonts w:ascii="Courier New" w:eastAsia="Courier New" w:hAnsi="Courier New" w:cs="Courier New"/>
+                <w:color w:val="D4D4D4"/>
+                <w:sz w:val="18"/>
+                <w:szCs w:val="18"/>
+              </w:rPr>
+              <w:t>Title","body":"Updated</w:t>
+            </w:r>
+            <w:proofErr w:type="spellEnd"/>
+            <w:r>
+              <w:rPr>
+                <w:rFonts w:ascii="Courier New" w:eastAsia="Courier New" w:hAnsi="Courier New" w:cs="Courier New"/>
+                <w:color w:val="D4D4D4"/>
+                <w:sz w:val="18"/>
+                <w:szCs w:val="18"/>
+              </w:rPr>
+              <w:t xml:space="preserve"> Body","userId":1}</w:t>
             </w:r>
           </w:p>
           <w:p>
@@ -2821,8 +3112,19 @@
                 <w:sz w:val="18"/>
                 <w:szCs w:val="18"/>
               </w:rPr>
-              <w:t xml:space="preserve">  Name: Content-Type    Value: application/json</w:t>
-            </w:r>
+              <w:t xml:space="preserve">  Name: Content-Type    Value: application/</w:t>
+            </w:r>
+            <w:proofErr w:type="spellStart"/>
+            <w:r>
+              <w:rPr>
+                <w:rFonts w:ascii="Courier New" w:eastAsia="Courier New" w:hAnsi="Courier New" w:cs="Courier New"/>
+                <w:color w:val="D4D4D4"/>
+                <w:sz w:val="18"/>
+                <w:szCs w:val="18"/>
+              </w:rPr>
+              <w:t>json</w:t>
+            </w:r>
+            <w:proofErr w:type="spellEnd"/>
           </w:p>
         </w:tc>
       </w:tr>
@@ -2891,10 +3193,11 @@
         <w:t xml:space="preserve"> = 200</w:t>
       </w:r>
     </w:p>
+    <w:p/>
+    <w:p/>
+    <w:p/>
+    <w:p/>
     <w:p>
-      <w:pPr>
-        <w:pStyle w:val="Heading2"/>
-      </w:pPr>
       <w:r>
         <w:br w:type="page"/>
       </w:r>
@@ -2960,7 +3263,21 @@
         <w:rPr>
           <w:color w:val="333333"/>
         </w:rPr>
-        <w:t>Response Body Assertion — verifies the response body contains the word 'userId'</w:t>
+        <w:t>Response Body Assertion — verifies the response body contains the word '</w:t>
+      </w:r>
+      <w:proofErr w:type="spellStart"/>
+      <w:r>
+        <w:rPr>
+          <w:color w:val="333333"/>
+        </w:rPr>
+        <w:t>userId</w:t>
+      </w:r>
+      <w:proofErr w:type="spellEnd"/>
+      <w:r>
+        <w:rPr>
+          <w:color w:val="333333"/>
+        </w:rPr>
+        <w:t>'</w:t>
       </w:r>
     </w:p>
     <w:p>
@@ -2989,8 +3306,16 @@
         <w:rPr>
           <w:color w:val="333333"/>
         </w:rPr>
-        <w:t>$.userId</w:t>
-      </w:r>
+        <w:t>$.</w:t>
+      </w:r>
+      <w:proofErr w:type="spellStart"/>
+      <w:r>
+        <w:rPr>
+          <w:color w:val="333333"/>
+        </w:rPr>
+        <w:t>userId</w:t>
+      </w:r>
+      <w:proofErr w:type="spellEnd"/>
       <w:proofErr w:type="gramEnd"/>
       <w:r>
         <w:rPr>
@@ -3130,8 +3455,19 @@
                 <w:sz w:val="18"/>
                 <w:szCs w:val="18"/>
               </w:rPr>
-              <w:t xml:space="preserve">  Field to Test: Response Body   Pattern: Contains   Value: userId</w:t>
-            </w:r>
+              <w:t xml:space="preserve">  Field to Test: Response Body   Pattern: Contains   Value: </w:t>
+            </w:r>
+            <w:proofErr w:type="spellStart"/>
+            <w:r>
+              <w:rPr>
+                <w:rFonts w:ascii="Courier New" w:eastAsia="Courier New" w:hAnsi="Courier New" w:cs="Courier New"/>
+                <w:color w:val="D4D4D4"/>
+                <w:sz w:val="18"/>
+                <w:szCs w:val="18"/>
+              </w:rPr>
+              <w:t>userId</w:t>
+            </w:r>
+            <w:proofErr w:type="spellEnd"/>
           </w:p>
           <w:p>
             <w:pPr>
@@ -3195,8 +3531,19 @@
                 <w:sz w:val="18"/>
                 <w:szCs w:val="18"/>
               </w:rPr>
-              <w:t>$.userId</w:t>
-            </w:r>
+              <w:t>$.</w:t>
+            </w:r>
+            <w:proofErr w:type="spellStart"/>
+            <w:r>
+              <w:rPr>
+                <w:rFonts w:ascii="Courier New" w:eastAsia="Courier New" w:hAnsi="Courier New" w:cs="Courier New"/>
+                <w:color w:val="D4D4D4"/>
+                <w:sz w:val="18"/>
+                <w:szCs w:val="18"/>
+              </w:rPr>
+              <w:t>userId</w:t>
+            </w:r>
+            <w:proofErr w:type="spellEnd"/>
             <w:proofErr w:type="gramEnd"/>
             <w:r>
               <w:rPr>
@@ -4770,6 +5117,7 @@
             <w:pPr>
               <w:spacing w:before="16" w:after="16"/>
             </w:pPr>
+            <w:proofErr w:type="spellStart"/>
             <w:r>
               <w:rPr>
                 <w:rFonts w:ascii="Courier New" w:eastAsia="Courier New" w:hAnsi="Courier New" w:cs="Courier New"/>
@@ -4799,6 +5147,7 @@
               </w:rPr>
               <w:t>_code</w:t>
             </w:r>
+            <w:proofErr w:type="spellEnd"/>
           </w:p>
           <w:p>
             <w:pPr>
@@ -4979,7 +5328,17 @@
                 <w:sz w:val="18"/>
                 <w:szCs w:val="18"/>
               </w:rPr>
-              <w:t>Variable Names:      post_</w:t>
+              <w:t xml:space="preserve">Variable Names:      </w:t>
+            </w:r>
+            <w:proofErr w:type="spellStart"/>
+            <w:r>
+              <w:rPr>
+                <w:rFonts w:ascii="Courier New" w:eastAsia="Courier New" w:hAnsi="Courier New" w:cs="Courier New"/>
+                <w:color w:val="D4D4D4"/>
+                <w:sz w:val="18"/>
+                <w:szCs w:val="18"/>
+              </w:rPr>
+              <w:t>post_</w:t>
             </w:r>
             <w:proofErr w:type="gramStart"/>
             <w:r>
@@ -5001,6 +5360,7 @@
               </w:rPr>
               <w:t>_code</w:t>
             </w:r>
+            <w:proofErr w:type="spellEnd"/>
           </w:p>
           <w:p>
             <w:pPr>
@@ -5077,14 +5437,28 @@
         <w:rPr>
           <w:color w:val="333333"/>
         </w:rPr>
-        <w:t>posts/${post_</w:t>
+        <w:t>posts/${</w:t>
+      </w:r>
+      <w:proofErr w:type="spellStart"/>
+      <w:r>
+        <w:rPr>
+          <w:color w:val="333333"/>
+        </w:rPr>
+        <w:t>post_</w:t>
       </w:r>
       <w:proofErr w:type="gramStart"/>
       <w:r>
         <w:rPr>
           <w:color w:val="333333"/>
         </w:rPr>
-        <w:t>id}  and</w:t>
+        <w:t>id</w:t>
+      </w:r>
+      <w:proofErr w:type="spellEnd"/>
+      <w:r>
+        <w:rPr>
+          <w:color w:val="333333"/>
+        </w:rPr>
+        <w:t>}  and</w:t>
       </w:r>
       <w:proofErr w:type="gramEnd"/>
       <w:r>
@@ -5105,7 +5479,21 @@
         <w:rPr>
           <w:color w:val="333333"/>
         </w:rPr>
-        <w:t>{expected_code}</w:t>
+        <w:t>{</w:t>
+      </w:r>
+      <w:proofErr w:type="spellStart"/>
+      <w:r>
+        <w:rPr>
+          <w:color w:val="333333"/>
+        </w:rPr>
+        <w:t>expected_code</w:t>
+      </w:r>
+      <w:proofErr w:type="spellEnd"/>
+      <w:r>
+        <w:rPr>
+          <w:color w:val="333333"/>
+        </w:rPr>
+        <w:t>}</w:t>
       </w:r>
     </w:p>
     <w:p>
@@ -5200,8 +5588,19 @@
                 <w:sz w:val="18"/>
                 <w:szCs w:val="18"/>
               </w:rPr>
-              <w:t>Variable name:   extracted_id</w:t>
-            </w:r>
+              <w:t xml:space="preserve">Variable name:   </w:t>
+            </w:r>
+            <w:proofErr w:type="spellStart"/>
+            <w:r>
+              <w:rPr>
+                <w:rFonts w:ascii="Courier New" w:eastAsia="Courier New" w:hAnsi="Courier New" w:cs="Courier New"/>
+                <w:color w:val="D4D4D4"/>
+                <w:sz w:val="18"/>
+                <w:szCs w:val="18"/>
+              </w:rPr>
+              <w:t>extracted_id</w:t>
+            </w:r>
+            <w:proofErr w:type="spellEnd"/>
           </w:p>
           <w:p>
             <w:pPr>
@@ -5247,7 +5646,27 @@
                 <w:sz w:val="18"/>
                 <w:szCs w:val="18"/>
               </w:rPr>
-              <w:t>Path: /posts/${extracted_id}/comments</w:t>
+              <w:t>Path: /posts/${</w:t>
+            </w:r>
+            <w:proofErr w:type="spellStart"/>
+            <w:r>
+              <w:rPr>
+                <w:rFonts w:ascii="Courier New" w:eastAsia="Courier New" w:hAnsi="Courier New" w:cs="Courier New"/>
+                <w:color w:val="D4D4D4"/>
+                <w:sz w:val="18"/>
+                <w:szCs w:val="18"/>
+              </w:rPr>
+              <w:t>extracted_id</w:t>
+            </w:r>
+            <w:proofErr w:type="spellEnd"/>
+            <w:r>
+              <w:rPr>
+                <w:rFonts w:ascii="Courier New" w:eastAsia="Courier New" w:hAnsi="Courier New" w:cs="Courier New"/>
+                <w:color w:val="D4D4D4"/>
+                <w:sz w:val="18"/>
+                <w:szCs w:val="18"/>
+              </w:rPr>
+              <w:t>}/comments</w:t>
             </w:r>
           </w:p>
           <w:p>
@@ -6082,8 +6501,16 @@
         <w:rPr>
           <w:color w:val="333333"/>
         </w:rPr>
-        <w:t>as  load_test.jmx</w:t>
-      </w:r>
+        <w:t xml:space="preserve">as  </w:t>
+      </w:r>
+      <w:proofErr w:type="spellStart"/>
+      <w:r>
+        <w:rPr>
+          <w:color w:val="333333"/>
+        </w:rPr>
+        <w:t>load_test.jmx</w:t>
+      </w:r>
+      <w:proofErr w:type="spellEnd"/>
       <w:proofErr w:type="gramEnd"/>
     </w:p>
     <w:p>
@@ -6177,14 +6604,25 @@
             <w:pPr>
               <w:spacing w:before="16" w:after="16"/>
             </w:pPr>
-            <w:r>
-              <w:rPr>
-                <w:rFonts w:ascii="Courier New" w:eastAsia="Courier New" w:hAnsi="Courier New" w:cs="Courier New"/>
-                <w:color w:val="D4D4D4"/>
-                <w:sz w:val="18"/>
-                <w:szCs w:val="18"/>
-              </w:rPr>
-              <w:t>jmeter -n -t C:\path\load_test.jmx -l C:\results\results.jtl -e -o C:\reports\</w:t>
+            <w:proofErr w:type="spellStart"/>
+            <w:r>
+              <w:rPr>
+                <w:rFonts w:ascii="Courier New" w:eastAsia="Courier New" w:hAnsi="Courier New" w:cs="Courier New"/>
+                <w:color w:val="D4D4D4"/>
+                <w:sz w:val="18"/>
+                <w:szCs w:val="18"/>
+              </w:rPr>
+              <w:t>jmeter</w:t>
+            </w:r>
+            <w:proofErr w:type="spellEnd"/>
+            <w:r>
+              <w:rPr>
+                <w:rFonts w:ascii="Courier New" w:eastAsia="Courier New" w:hAnsi="Courier New" w:cs="Courier New"/>
+                <w:color w:val="D4D4D4"/>
+                <w:sz w:val="18"/>
+                <w:szCs w:val="18"/>
+              </w:rPr>
+              <w:t xml:space="preserve"> -n -t C:\path\load_test.jmx -l C:\results\results.jtl -e -o C:\reports\</w:t>
             </w:r>
           </w:p>
           <w:p>
@@ -6217,7 +6655,27 @@
                 <w:sz w:val="18"/>
                 <w:szCs w:val="18"/>
               </w:rPr>
-              <w:t>cd /opt/jmeter/bin</w:t>
+              <w:t>cd /opt/</w:t>
+            </w:r>
+            <w:proofErr w:type="spellStart"/>
+            <w:r>
+              <w:rPr>
+                <w:rFonts w:ascii="Courier New" w:eastAsia="Courier New" w:hAnsi="Courier New" w:cs="Courier New"/>
+                <w:color w:val="D4D4D4"/>
+                <w:sz w:val="18"/>
+                <w:szCs w:val="18"/>
+              </w:rPr>
+              <w:t>jmeter</w:t>
+            </w:r>
+            <w:proofErr w:type="spellEnd"/>
+            <w:r>
+              <w:rPr>
+                <w:rFonts w:ascii="Courier New" w:eastAsia="Courier New" w:hAnsi="Courier New" w:cs="Courier New"/>
+                <w:color w:val="D4D4D4"/>
+                <w:sz w:val="18"/>
+                <w:szCs w:val="18"/>
+              </w:rPr>
+              <w:t>/bin</w:t>
             </w:r>
           </w:p>
           <w:p>
@@ -6231,7 +6689,47 @@
                 <w:sz w:val="18"/>
                 <w:szCs w:val="18"/>
               </w:rPr>
-              <w:t>./jmeter.sh -n -t ~/load_test.jmx -l ~/results/results.jtl -e -o ~/reports/</w:t>
+              <w:t>./jmeter.sh -n -t ~/</w:t>
+            </w:r>
+            <w:proofErr w:type="spellStart"/>
+            <w:r>
+              <w:rPr>
+                <w:rFonts w:ascii="Courier New" w:eastAsia="Courier New" w:hAnsi="Courier New" w:cs="Courier New"/>
+                <w:color w:val="D4D4D4"/>
+                <w:sz w:val="18"/>
+                <w:szCs w:val="18"/>
+              </w:rPr>
+              <w:t>load_test.jmx</w:t>
+            </w:r>
+            <w:proofErr w:type="spellEnd"/>
+            <w:r>
+              <w:rPr>
+                <w:rFonts w:ascii="Courier New" w:eastAsia="Courier New" w:hAnsi="Courier New" w:cs="Courier New"/>
+                <w:color w:val="D4D4D4"/>
+                <w:sz w:val="18"/>
+                <w:szCs w:val="18"/>
+              </w:rPr>
+              <w:t xml:space="preserve"> -l ~/results/</w:t>
+            </w:r>
+            <w:proofErr w:type="spellStart"/>
+            <w:r>
+              <w:rPr>
+                <w:rFonts w:ascii="Courier New" w:eastAsia="Courier New" w:hAnsi="Courier New" w:cs="Courier New"/>
+                <w:color w:val="D4D4D4"/>
+                <w:sz w:val="18"/>
+                <w:szCs w:val="18"/>
+              </w:rPr>
+              <w:t>results.jtl</w:t>
+            </w:r>
+            <w:proofErr w:type="spellEnd"/>
+            <w:r>
+              <w:rPr>
+                <w:rFonts w:ascii="Courier New" w:eastAsia="Courier New" w:hAnsi="Courier New" w:cs="Courier New"/>
+                <w:color w:val="D4D4D4"/>
+                <w:sz w:val="18"/>
+                <w:szCs w:val="18"/>
+              </w:rPr>
+              <w:t xml:space="preserve"> -e -o ~/reports/</w:t>
             </w:r>
           </w:p>
           <w:p>
@@ -6328,8 +6826,19 @@
                 <w:sz w:val="18"/>
                 <w:szCs w:val="18"/>
               </w:rPr>
-              <w:t>your .jmx</w:t>
-            </w:r>
+              <w:t>your .</w:t>
+            </w:r>
+            <w:proofErr w:type="spellStart"/>
+            <w:r>
+              <w:rPr>
+                <w:rFonts w:ascii="Courier New" w:eastAsia="Courier New" w:hAnsi="Courier New" w:cs="Courier New"/>
+                <w:color w:val="D4D4D4"/>
+                <w:sz w:val="18"/>
+                <w:szCs w:val="18"/>
+              </w:rPr>
+              <w:t>jmx</w:t>
+            </w:r>
+            <w:proofErr w:type="spellEnd"/>
             <w:proofErr w:type="gramEnd"/>
             <w:r>
               <w:rPr>
@@ -6372,7 +6881,27 @@
                 <w:sz w:val="18"/>
                 <w:szCs w:val="18"/>
               </w:rPr>
-              <w:t xml:space="preserve"> to save the raw results (.jtl file)</w:t>
+              <w:t xml:space="preserve"> to save the raw results (.</w:t>
+            </w:r>
+            <w:proofErr w:type="spellStart"/>
+            <w:r>
+              <w:rPr>
+                <w:rFonts w:ascii="Courier New" w:eastAsia="Courier New" w:hAnsi="Courier New" w:cs="Courier New"/>
+                <w:color w:val="D4D4D4"/>
+                <w:sz w:val="18"/>
+                <w:szCs w:val="18"/>
+              </w:rPr>
+              <w:t>jtl</w:t>
+            </w:r>
+            <w:proofErr w:type="spellEnd"/>
+            <w:r>
+              <w:rPr>
+                <w:rFonts w:ascii="Courier New" w:eastAsia="Courier New" w:hAnsi="Courier New" w:cs="Courier New"/>
+                <w:color w:val="D4D4D4"/>
+                <w:sz w:val="18"/>
+                <w:szCs w:val="18"/>
+              </w:rPr>
+              <w:t xml:space="preserve"> file)</w:t>
             </w:r>
           </w:p>
           <w:p>
@@ -6651,8 +7180,16 @@
         <w:rPr>
           <w:color w:val="333333"/>
         </w:rPr>
-        <w:t>named  jmeter</w:t>
-      </w:r>
+        <w:t xml:space="preserve">named  </w:t>
+      </w:r>
+      <w:proofErr w:type="spellStart"/>
+      <w:r>
+        <w:rPr>
+          <w:color w:val="333333"/>
+        </w:rPr>
+        <w:t>jmeter</w:t>
+      </w:r>
+      <w:proofErr w:type="spellEnd"/>
       <w:proofErr w:type="gramEnd"/>
       <w:r>
         <w:rPr>
@@ -6680,7 +7217,21 @@
         <w:rPr>
           <w:color w:val="333333"/>
         </w:rPr>
-        <w:t xml:space="preserve">Upload your load_test.jmx file into a folder </w:t>
+        <w:t xml:space="preserve">Upload your </w:t>
+      </w:r>
+      <w:proofErr w:type="spellStart"/>
+      <w:r>
+        <w:rPr>
+          <w:color w:val="333333"/>
+        </w:rPr>
+        <w:t>load_test.jmx</w:t>
+      </w:r>
+      <w:proofErr w:type="spellEnd"/>
+      <w:r>
+        <w:rPr>
+          <w:color w:val="333333"/>
+        </w:rPr>
+        <w:t xml:space="preserve"> file into a folder </w:t>
       </w:r>
       <w:proofErr w:type="gramStart"/>
       <w:r>
@@ -6716,8 +7267,30 @@
         <w:rPr>
           <w:color w:val="333333"/>
         </w:rPr>
-        <w:t>Create a new file at this path in the repository:  .github/workflows/jmeter.yml</w:t>
-      </w:r>
+        <w:t>Create a new file at this path in the repository:  .</w:t>
+      </w:r>
+      <w:proofErr w:type="spellStart"/>
+      <w:r>
+        <w:rPr>
+          <w:color w:val="333333"/>
+        </w:rPr>
+        <w:t>github</w:t>
+      </w:r>
+      <w:proofErr w:type="spellEnd"/>
+      <w:r>
+        <w:rPr>
+          <w:color w:val="333333"/>
+        </w:rPr>
+        <w:t>/workflows/</w:t>
+      </w:r>
+      <w:proofErr w:type="spellStart"/>
+      <w:r>
+        <w:rPr>
+          <w:color w:val="333333"/>
+        </w:rPr>
+        <w:t>jmeter.yml</w:t>
+      </w:r>
+      <w:proofErr w:type="spellEnd"/>
     </w:p>
     <w:p>
       <w:pPr>
@@ -7016,7 +7589,27 @@
                 <w:sz w:val="18"/>
                 <w:szCs w:val="18"/>
               </w:rPr>
-              <w:t xml:space="preserve">          distribution: 'temurin'</w:t>
+              <w:t xml:space="preserve">          distribution: '</w:t>
+            </w:r>
+            <w:proofErr w:type="spellStart"/>
+            <w:r>
+              <w:rPr>
+                <w:rFonts w:ascii="Courier New" w:eastAsia="Courier New" w:hAnsi="Courier New" w:cs="Courier New"/>
+                <w:color w:val="D4D4D4"/>
+                <w:sz w:val="18"/>
+                <w:szCs w:val="18"/>
+              </w:rPr>
+              <w:t>temurin</w:t>
+            </w:r>
+            <w:proofErr w:type="spellEnd"/>
+            <w:r>
+              <w:rPr>
+                <w:rFonts w:ascii="Courier New" w:eastAsia="Courier New" w:hAnsi="Courier New" w:cs="Courier New"/>
+                <w:color w:val="D4D4D4"/>
+                <w:sz w:val="18"/>
+                <w:szCs w:val="18"/>
+              </w:rPr>
+              <w:t>'</w:t>
             </w:r>
           </w:p>
           <w:p>
@@ -7063,7 +7656,27 @@
                 <w:sz w:val="18"/>
                 <w:szCs w:val="18"/>
               </w:rPr>
-              <w:t xml:space="preserve">          wget -q https://downloads.apache.org/jmeter/binaries/apache-jmeter-5.6.3.tgz</w:t>
+              <w:t xml:space="preserve">          </w:t>
+            </w:r>
+            <w:proofErr w:type="spellStart"/>
+            <w:r>
+              <w:rPr>
+                <w:rFonts w:ascii="Courier New" w:eastAsia="Courier New" w:hAnsi="Courier New" w:cs="Courier New"/>
+                <w:color w:val="D4D4D4"/>
+                <w:sz w:val="18"/>
+                <w:szCs w:val="18"/>
+              </w:rPr>
+              <w:t>wget</w:t>
+            </w:r>
+            <w:proofErr w:type="spellEnd"/>
+            <w:r>
+              <w:rPr>
+                <w:rFonts w:ascii="Courier New" w:eastAsia="Courier New" w:hAnsi="Courier New" w:cs="Courier New"/>
+                <w:color w:val="D4D4D4"/>
+                <w:sz w:val="18"/>
+                <w:szCs w:val="18"/>
+              </w:rPr>
+              <w:t xml:space="preserve"> -q https://downloads.apache.org/jmeter/binaries/apache-jmeter-5.6.3.tgz</w:t>
             </w:r>
           </w:p>
           <w:p>
@@ -7077,8 +7690,39 @@
                 <w:sz w:val="18"/>
                 <w:szCs w:val="18"/>
               </w:rPr>
-              <w:t xml:space="preserve">          tar -xzf apache-jmeter-5.6.3.tgz &amp;&amp; mv apache-jmeter-5.6.3 jmeter</w:t>
-            </w:r>
+              <w:t xml:space="preserve">          tar -</w:t>
+            </w:r>
+            <w:proofErr w:type="spellStart"/>
+            <w:r>
+              <w:rPr>
+                <w:rFonts w:ascii="Courier New" w:eastAsia="Courier New" w:hAnsi="Courier New" w:cs="Courier New"/>
+                <w:color w:val="D4D4D4"/>
+                <w:sz w:val="18"/>
+                <w:szCs w:val="18"/>
+              </w:rPr>
+              <w:t>xzf</w:t>
+            </w:r>
+            <w:proofErr w:type="spellEnd"/>
+            <w:r>
+              <w:rPr>
+                <w:rFonts w:ascii="Courier New" w:eastAsia="Courier New" w:hAnsi="Courier New" w:cs="Courier New"/>
+                <w:color w:val="D4D4D4"/>
+                <w:sz w:val="18"/>
+                <w:szCs w:val="18"/>
+              </w:rPr>
+              <w:t xml:space="preserve"> apache-jmeter-5.6.3.tgz &amp;&amp; mv apache-jmeter-5.6.3 </w:t>
+            </w:r>
+            <w:proofErr w:type="spellStart"/>
+            <w:r>
+              <w:rPr>
+                <w:rFonts w:ascii="Courier New" w:eastAsia="Courier New" w:hAnsi="Courier New" w:cs="Courier New"/>
+                <w:color w:val="D4D4D4"/>
+                <w:sz w:val="18"/>
+                <w:szCs w:val="18"/>
+              </w:rPr>
+              <w:t>jmeter</w:t>
+            </w:r>
+            <w:proofErr w:type="spellEnd"/>
           </w:p>
           <w:p>
             <w:pPr>
@@ -7124,7 +7768,27 @@
                 <w:sz w:val="18"/>
                 <w:szCs w:val="18"/>
               </w:rPr>
-              <w:t xml:space="preserve">          mkdir -p results reports</w:t>
+              <w:t xml:space="preserve">          </w:t>
+            </w:r>
+            <w:proofErr w:type="spellStart"/>
+            <w:r>
+              <w:rPr>
+                <w:rFonts w:ascii="Courier New" w:eastAsia="Courier New" w:hAnsi="Courier New" w:cs="Courier New"/>
+                <w:color w:val="D4D4D4"/>
+                <w:sz w:val="18"/>
+                <w:szCs w:val="18"/>
+              </w:rPr>
+              <w:t>mkdir</w:t>
+            </w:r>
+            <w:proofErr w:type="spellEnd"/>
+            <w:r>
+              <w:rPr>
+                <w:rFonts w:ascii="Courier New" w:eastAsia="Courier New" w:hAnsi="Courier New" w:cs="Courier New"/>
+                <w:color w:val="D4D4D4"/>
+                <w:sz w:val="18"/>
+                <w:szCs w:val="18"/>
+              </w:rPr>
+              <w:t xml:space="preserve"> -p results reports</w:t>
             </w:r>
           </w:p>
           <w:p>
@@ -7138,7 +7802,47 @@
                 <w:sz w:val="18"/>
                 <w:szCs w:val="18"/>
               </w:rPr>
-              <w:t xml:space="preserve">          jmeter/bin/jmeter -n \</w:t>
+              <w:t xml:space="preserve">          </w:t>
+            </w:r>
+            <w:proofErr w:type="spellStart"/>
+            <w:r>
+              <w:rPr>
+                <w:rFonts w:ascii="Courier New" w:eastAsia="Courier New" w:hAnsi="Courier New" w:cs="Courier New"/>
+                <w:color w:val="D4D4D4"/>
+                <w:sz w:val="18"/>
+                <w:szCs w:val="18"/>
+              </w:rPr>
+              <w:t>jmeter</w:t>
+            </w:r>
+            <w:proofErr w:type="spellEnd"/>
+            <w:r>
+              <w:rPr>
+                <w:rFonts w:ascii="Courier New" w:eastAsia="Courier New" w:hAnsi="Courier New" w:cs="Courier New"/>
+                <w:color w:val="D4D4D4"/>
+                <w:sz w:val="18"/>
+                <w:szCs w:val="18"/>
+              </w:rPr>
+              <w:t>/bin/</w:t>
+            </w:r>
+            <w:proofErr w:type="spellStart"/>
+            <w:r>
+              <w:rPr>
+                <w:rFonts w:ascii="Courier New" w:eastAsia="Courier New" w:hAnsi="Courier New" w:cs="Courier New"/>
+                <w:color w:val="D4D4D4"/>
+                <w:sz w:val="18"/>
+                <w:szCs w:val="18"/>
+              </w:rPr>
+              <w:t>jmeter</w:t>
+            </w:r>
+            <w:proofErr w:type="spellEnd"/>
+            <w:r>
+              <w:rPr>
+                <w:rFonts w:ascii="Courier New" w:eastAsia="Courier New" w:hAnsi="Courier New" w:cs="Courier New"/>
+                <w:color w:val="D4D4D4"/>
+                <w:sz w:val="18"/>
+                <w:szCs w:val="18"/>
+              </w:rPr>
+              <w:t xml:space="preserve"> -n \</w:t>
             </w:r>
           </w:p>
           <w:p>
@@ -7152,7 +7856,27 @@
                 <w:sz w:val="18"/>
                 <w:szCs w:val="18"/>
               </w:rPr>
-              <w:t xml:space="preserve">            -t tests/load_test.jmx \</w:t>
+              <w:t xml:space="preserve">            -t tests/</w:t>
+            </w:r>
+            <w:proofErr w:type="spellStart"/>
+            <w:r>
+              <w:rPr>
+                <w:rFonts w:ascii="Courier New" w:eastAsia="Courier New" w:hAnsi="Courier New" w:cs="Courier New"/>
+                <w:color w:val="D4D4D4"/>
+                <w:sz w:val="18"/>
+                <w:szCs w:val="18"/>
+              </w:rPr>
+              <w:t>load_test.jmx</w:t>
+            </w:r>
+            <w:proofErr w:type="spellEnd"/>
+            <w:r>
+              <w:rPr>
+                <w:rFonts w:ascii="Courier New" w:eastAsia="Courier New" w:hAnsi="Courier New" w:cs="Courier New"/>
+                <w:color w:val="D4D4D4"/>
+                <w:sz w:val="18"/>
+                <w:szCs w:val="18"/>
+              </w:rPr>
+              <w:t xml:space="preserve"> \</w:t>
             </w:r>
           </w:p>
           <w:p>
@@ -7166,7 +7890,27 @@
                 <w:sz w:val="18"/>
                 <w:szCs w:val="18"/>
               </w:rPr>
-              <w:t xml:space="preserve">            -l results/results.jtl \</w:t>
+              <w:t xml:space="preserve">            -l results/</w:t>
+            </w:r>
+            <w:proofErr w:type="spellStart"/>
+            <w:r>
+              <w:rPr>
+                <w:rFonts w:ascii="Courier New" w:eastAsia="Courier New" w:hAnsi="Courier New" w:cs="Courier New"/>
+                <w:color w:val="D4D4D4"/>
+                <w:sz w:val="18"/>
+                <w:szCs w:val="18"/>
+              </w:rPr>
+              <w:t>results.jtl</w:t>
+            </w:r>
+            <w:proofErr w:type="spellEnd"/>
+            <w:r>
+              <w:rPr>
+                <w:rFonts w:ascii="Courier New" w:eastAsia="Courier New" w:hAnsi="Courier New" w:cs="Courier New"/>
+                <w:color w:val="D4D4D4"/>
+                <w:sz w:val="18"/>
+                <w:szCs w:val="18"/>
+              </w:rPr>
+              <w:t xml:space="preserve"> \</w:t>
             </w:r>
           </w:p>
           <w:p>
@@ -7275,7 +8019,27 @@
                 <w:sz w:val="18"/>
                 <w:szCs w:val="18"/>
               </w:rPr>
-              <w:t xml:space="preserve">          name: jmeter-report</w:t>
+              <w:t xml:space="preserve">          name: </w:t>
+            </w:r>
+            <w:proofErr w:type="spellStart"/>
+            <w:r>
+              <w:rPr>
+                <w:rFonts w:ascii="Courier New" w:eastAsia="Courier New" w:hAnsi="Courier New" w:cs="Courier New"/>
+                <w:color w:val="D4D4D4"/>
+                <w:sz w:val="18"/>
+                <w:szCs w:val="18"/>
+              </w:rPr>
+              <w:t>jmeter</w:t>
+            </w:r>
+            <w:proofErr w:type="spellEnd"/>
+            <w:r>
+              <w:rPr>
+                <w:rFonts w:ascii="Courier New" w:eastAsia="Courier New" w:hAnsi="Courier New" w:cs="Courier New"/>
+                <w:color w:val="D4D4D4"/>
+                <w:sz w:val="18"/>
+                <w:szCs w:val="18"/>
+              </w:rPr>
+              <w:t>-report</w:t>
             </w:r>
           </w:p>
           <w:p>
@@ -7382,8 +8146,17 @@
               <w:rFonts w:ascii="Arial Unicode MS" w:eastAsia="Arial Unicode MS" w:hAnsi="Arial Unicode MS" w:cs="Arial Unicode MS"/>
               <w:color w:val="333333"/>
             </w:rPr>
-            <w:t>the  jmeter</w:t>
+            <w:t xml:space="preserve">the  </w:t>
           </w:r>
+          <w:proofErr w:type="spellStart"/>
+          <w:r>
+            <w:rPr>
+              <w:rFonts w:ascii="Arial Unicode MS" w:eastAsia="Arial Unicode MS" w:hAnsi="Arial Unicode MS" w:cs="Arial Unicode MS"/>
+              <w:color w:val="333333"/>
+            </w:rPr>
+            <w:t>jmeter</w:t>
+          </w:r>
+          <w:proofErr w:type="spellEnd"/>
           <w:proofErr w:type="gramEnd"/>
           <w:r>
             <w:rPr>
@@ -7908,7 +8681,25 @@
                 <w:sz w:val="18"/>
                 <w:szCs w:val="18"/>
               </w:rPr>
-              <w:t>Screenshot of the downloaded jmeter-report artifact from GitHub Actions</w:t>
+              <w:t xml:space="preserve">Screenshot of the downloaded </w:t>
+            </w:r>
+            <w:proofErr w:type="spellStart"/>
+            <w:r>
+              <w:rPr>
+                <w:color w:val="333333"/>
+                <w:sz w:val="18"/>
+                <w:szCs w:val="18"/>
+              </w:rPr>
+              <w:t>jmeter</w:t>
+            </w:r>
+            <w:proofErr w:type="spellEnd"/>
+            <w:r>
+              <w:rPr>
+                <w:color w:val="333333"/>
+                <w:sz w:val="18"/>
+                <w:szCs w:val="18"/>
+              </w:rPr>
+              <w:t>-report artifact from GitHub Actions</w:t>
             </w:r>
           </w:p>
         </w:tc>
@@ -7925,8 +8716,13 @@
       </w:r>
       <w:proofErr w:type="gramStart"/>
       <w:r>
-        <w:t>student's .jtl</w:t>
-      </w:r>
+        <w:t>student's .</w:t>
+      </w:r>
+      <w:proofErr w:type="spellStart"/>
+      <w:r>
+        <w:t>jtl</w:t>
+      </w:r>
+      <w:proofErr w:type="spellEnd"/>
       <w:proofErr w:type="gramEnd"/>
       <w:r>
         <w:t xml:space="preserve"> result file has unique timing values for plagiarism checking.</w:t>
@@ -7948,8 +8744,13 @@
       </w:r>
       <w:proofErr w:type="gramStart"/>
       <w:r>
-        <w:t>your .jmx</w:t>
-      </w:r>
+        <w:t>your .</w:t>
+      </w:r>
+      <w:proofErr w:type="spellStart"/>
+      <w:r>
+        <w:t>jmx</w:t>
+      </w:r>
+      <w:proofErr w:type="spellEnd"/>
       <w:proofErr w:type="gramEnd"/>
       <w:r>
         <w:t xml:space="preserve"> test plan file. Include your Name, Student ID, and Date on the cover page.</w:t>
@@ -8704,7 +9505,23 @@
                 <w:b/>
                 <w:bCs/>
               </w:rPr>
-              <w:t>Avg Response (ms)</w:t>
+              <w:t>Avg Response (</w:t>
+            </w:r>
+            <w:proofErr w:type="spellStart"/>
+            <w:r>
+              <w:rPr>
+                <w:b/>
+                <w:bCs/>
+              </w:rPr>
+              <w:t>ms</w:t>
+            </w:r>
+            <w:proofErr w:type="spellEnd"/>
+            <w:r>
+              <w:rPr>
+                <w:b/>
+                <w:bCs/>
+              </w:rPr>
+              <w:t>)</w:t>
             </w:r>
           </w:p>
         </w:tc>
@@ -8785,7 +9602,23 @@
                 <w:b/>
                 <w:bCs/>
               </w:rPr>
-              <w:t>Max Response (ms)</w:t>
+              <w:t>Max Response (</w:t>
+            </w:r>
+            <w:proofErr w:type="spellStart"/>
+            <w:r>
+              <w:rPr>
+                <w:b/>
+                <w:bCs/>
+              </w:rPr>
+              <w:t>ms</w:t>
+            </w:r>
+            <w:proofErr w:type="spellEnd"/>
+            <w:r>
+              <w:rPr>
+                <w:b/>
+                <w:bCs/>
+              </w:rPr>
+              <w:t>)</w:t>
             </w:r>
           </w:p>
         </w:tc>
@@ -9156,8 +9989,8 @@
     </w:tbl>
     <w:p/>
     <w:sectPr>
-      <w:headerReference w:type="default" r:id="rId12"/>
-      <w:footerReference w:type="default" r:id="rId13"/>
+      <w:headerReference w:type="default" r:id="rId14"/>
+      <w:footerReference w:type="default" r:id="rId15"/>
       <w:pgSz w:w="12240" w:h="15840"/>
       <w:pgMar w:top="1080" w:right="1080" w:bottom="1080" w:left="1080" w:header="708" w:footer="708" w:gutter="0"/>
       <w:pgNumType w:start="1"/>
@@ -9248,8 +10081,18 @@
         <w:sz w:val="16"/>
         <w:szCs w:val="16"/>
       </w:rPr>
-      <w:t xml:space="preserve">   |   Instructor: Yella Mehroze</w:t>
+      <w:t xml:space="preserve">   |   Instructor: Yella </w:t>
     </w:r>
+    <w:proofErr w:type="spellStart"/>
+    <w:r>
+      <w:rPr>
+        <w:color w:val="888888"/>
+        <w:sz w:val="16"/>
+        <w:szCs w:val="16"/>
+      </w:rPr>
+      <w:t>Mehroze</w:t>
+    </w:r>
+    <w:proofErr w:type="spellEnd"/>
   </w:p>
 </w:hdr>
 </file>

</xml_diff>